<commit_message>
Identify collaborator's primary care role in heading (h)
Internal medicine primary care satisfies heading (h)'s request for an allied
CKM provider, so the earlier recommendation to recruit a family physician was
wrong. The actual gap was that the LOI described Dr. Eun only as 'Attending
Physician,' leaving the team's primary care representation invisible to a
reviewer. Heading (h) now identifies him as the board-certified primary care
internist who sees these stage 1-2 patients, holding the description at
494/500 words. Update both documents and the notes accordingly.

Co-Authored-By: Claude Opus 4.8 <noreply@anthropic.com>
Claude-Session: https://claude.ai/code/session_01E69iBL6ckgtG1oXYAcnRgc
</commit_message>
<xml_diff>
--- a/docs/REACH_LOI_review_draft.docx
+++ b/docs/REACH_LOI_review_draft.docx
@@ -1539,7 +1539,7 @@
           <w:sz w:val="20"/>
           <w:szCs w:val="20"/>
         </w:rPr>
-        <w:t xml:space="preserve">Dr. Yong Eun, Attending Physician at NYC H+H/Harlem, first author of our semaglutide pharmacoepidemiology paper in Neurology (2026), supports this project and will co-lead the analysis; Dr. Marie S. Thearle adds cardiometabolic expertise. Primary care colleagues will review deliverables.</w:t>
+        <w:t xml:space="preserve">Dr. Yong Eun, the board-certified primary care internist who sees these stage 1-2 patients at NYC H+H/Harlem and first-authored our Neurology (2026) semaglutide paper, supports this project and will co-lead the analysis; Dr. Marie S. Thearle adds cardiometabolic expertise.</w:t>
       </w:r>
     </w:p>
     <w:p>
@@ -2514,7 +2514,7 @@
           <w:sz w:val="19"/>
           <w:szCs w:val="19"/>
         </w:rPr>
-        <w:t xml:space="preserve">Section i) turns a potential objection into an argument: as the endocrinologist these patients reach only after progressing, the applicant is building evidence for the clinicians upstream.</w:t>
+        <w:t xml:space="preserve">Section i) turns a potential objection into an argument: as the endocrinologist these patients reach only after progressing, the applicant is building evidence for the clinicians upstream. Section h) now identifies Dr. Eun as the primary care internist who sees these patients first, so the team’s primary care representation is explicit.</w:t>
       </w:r>
     </w:p>
     <w:p>
@@ -2533,18 +2533,18 @@
           <w:sz w:val="26"/>
           <w:szCs w:val="26"/>
         </w:rPr>
-        <w:t xml:space="preserve">Decision needed before submission</w:t>
+        <w:t xml:space="preserve">Primary care representation</w:t>
       </w:r>
     </w:p>
     <w:p>
       <w:pPr>
         <w:pBdr>
-          <w:top w:val="single" w:color="C00000" w:sz="4" w:space="6"/>
-          <w:bottom w:val="single" w:color="C00000" w:sz="4" w:space="6"/>
-          <w:left w:val="single" w:color="C00000" w:sz="12" w:space="6"/>
-          <w:right w:val="single" w:color="C00000" w:sz="4" w:space="6"/>
+          <w:top w:val="single" w:color="2E7D32" w:sz="4" w:space="6"/>
+          <w:bottom w:val="single" w:color="2E7D32" w:sz="4" w:space="6"/>
+          <w:left w:val="single" w:color="2E7D32" w:sz="12" w:space="6"/>
+          <w:right w:val="single" w:color="2E7D32" w:sz="4" w:space="6"/>
         </w:pBdr>
-        <w:shd w:fill="FDECEA" w:color="auto" w:val="clear"/>
+        <w:shd w:fill="EAF4EC" w:color="auto" w:val="clear"/>
         <w:spacing w:after="140" w:before="60"/>
       </w:pPr>
       <w:r>
@@ -2558,7 +2558,7 @@
           <w:sz w:val="20"/>
           <w:szCs w:val="20"/>
         </w:rPr>
-        <w:t xml:space="preserve">Name an allied CKM collaborator outside the applicant’s division. </w:t>
+        <w:t xml:space="preserve">Satisfied. </w:t>
       </w:r>
       <w:r>
         <w:rPr>
@@ -2597,7 +2597,26 @@
           <w:sz w:val="20"/>
           <w:szCs w:val="20"/>
         </w:rPr>
-        <w:t xml:space="preserve"> healthcare providers. Both named supporters are internal medicine or endocrine colleagues at the same institution, which reviewers flagged as the single largest remaining score risk. Recruiting one family physician, nephrologist, pharmacist, or dietitian who will confirm support would answer the heading as written and strengthen fit with a family-physician-focused award. No supporter was invented for this draft, because an unverifiable name would be disqualifying.</w:t>
+        <w:t xml:space="preserve"> healthcare providers and at least one person who supports the project. Dr. Eun is a board-certified internist practicing primary care — internal medicine is a primary care discipline and ABIM certification is the correct credential — so the team pairs the endocrinologist who sees these patients after progression with the primary care physician who sees them before it. Heading h) now states that role explicitly, rather than listing him as “Attending Physician,” which left the strongest funder-fit asset invisible to a reviewer.</w:t>
+      </w:r>
+    </w:p>
+    <w:p>
+      <w:pPr>
+        <w:spacing w:after="120" w:before="60" w:line="276"/>
+        <w:jc w:val="left"/>
+      </w:pPr>
+      <w:r>
+        <w:rPr>
+          <w:rFonts w:ascii="Arial" w:cs="Arial" w:eastAsia="Arial" w:hAnsi="Arial"/>
+          <w:b w:val="false"/>
+          <w:bCs w:val="false"/>
+          <w:i/>
+          <w:iCs/>
+          <w:color w:val="595959"/>
+          <w:sz w:val="18"/>
+          <w:szCs w:val="18"/>
+        </w:rPr>
+        <w:t xml:space="preserve">Optional, not required: adding a nephrologist, pharmacist, or dietitian would broaden the multidisciplinary picture that the word “allied” invites. Worth doing only if a genuine supporter is available — an unverifiable name would be disqualifying.</w:t>
       </w:r>
     </w:p>
     <w:p>

</xml_diff>

<commit_message>
State SGLT2i handling as baseline balance only
Replace 'SGLT2 inhibitors time-varying' with 'SGLT2i balanced at baseline.'
Post-baseline SGLT2i initiation is a time-varying confounder affected by prior
treatment, so naive time-varying adjustment would block part of the effect
being estimated and conflicts with the stated intention-to-treat estimand.
Correct handling needs g-methods or censoring at initiation, which belongs in
the full protocol rather than a screening letter. Description now 498/500 words.

Co-Authored-By: Claude Opus 4.8 <noreply@anthropic.com>
Claude-Session: https://claude.ai/code/session_01E69iBL6ckgtG1oXYAcnRgc
</commit_message>
<xml_diff>
--- a/docs/REACH_LOI_review_draft.docx
+++ b/docs/REACH_LOI_review_draft.docx
@@ -525,7 +525,7 @@
                 <w:sz w:val="19"/>
                 <w:szCs w:val="19"/>
               </w:rPr>
-              <w:t xml:space="preserve">497 words</w:t>
+              <w:t xml:space="preserve">498 words</w:t>
             </w:r>
           </w:p>
         </w:tc>
@@ -552,7 +552,7 @@
                 <w:sz w:val="19"/>
                 <w:szCs w:val="19"/>
               </w:rPr>
-              <w:t xml:space="preserve">PASS — 3 to spare</w:t>
+              <w:t xml:space="preserve">PASS — 2 to spare</w:t>
             </w:r>
           </w:p>
         </w:tc>
@@ -984,7 +984,7 @@
           <w:sz w:val="26"/>
           <w:szCs w:val="26"/>
         </w:rPr>
-        <w:t xml:space="preserve">Project description (497 of 500 words)</w:t>
+        <w:t xml:space="preserve">Project description (498 of 500 words)</w:t>
       </w:r>
     </w:p>
     <w:p>
@@ -1235,7 +1235,7 @@
           <w:sz w:val="17"/>
           <w:szCs w:val="17"/>
         </w:rPr>
-        <w:t xml:space="preserve">   99 words</w:t>
+        <w:t xml:space="preserve">   100 words</w:t>
       </w:r>
     </w:p>
     <w:p>
@@ -1271,7 +1271,7 @@
           <w:sz w:val="20"/>
           <w:szCs w:val="20"/>
         </w:rPr>
-        <w:t xml:space="preserve">Eligible: adults staged CKM 1-2 with baseline labs, no prior-year GLP-1 RA. Strategies: GLP-1 RA (tirzepatide included) versus DPP-4 inhibitor (no MACE benefit) in type 2 diabetes, otherwise versus non-incretin anti-obesity medication; a secondary comparator adds sulfonylureas, bracketing weight-gain bias. Time zero: first fill; 90-day grace period, clone-censoring and censoring weights remove immortal time; propensity-score overlap weighting approximates randomized assignment, SGLT2 inhibitors time-varying. Re-staged six-monthly; progression is primary, regression a lower stage at two consecutive assessments on reversible components; stage 3 by PREVENT risk; death competes (multistate model). Observational intention-to-treat; per-protocol censoring 60-day gaps; E-values bound unmeasured confounding.</w:t>
+        <w:t xml:space="preserve">Eligible: adults staged CKM 1-2 with baseline labs, no prior-year GLP-1 RA. Strategies: GLP-1 RA (tirzepatide included) versus DPP-4 inhibitor (no MACE benefit) in type 2 diabetes, otherwise versus non-incretin anti-obesity medication; a secondary comparator adds sulfonylureas, bracketing weight-gain bias. Time zero: first fill; 90-day grace period, clone-censoring and censoring weights remove immortal time; propensity-score overlap weighting approximates randomized assignment, SGLT2i balanced at baseline. Re-staged six-monthly; progression is primary, regression a lower stage at two consecutive assessments on reversible components; stage 3 by PREVENT risk; death competes (multistate model). Observational intention-to-treat; per-protocol censoring 60-day gaps; E-values bound unmeasured confounding.</w:t>
       </w:r>
     </w:p>
     <w:p>

</xml_diff>